<commit_message>
Add submission-ready thesis DOCX with production WAN benchmarks.
Includes ScribeFlow_REVISED.docx (figures preserved), Table VI results for scribeflow-two.vercel.app, and updated merge script for ap-south-1 deployment.
</commit_message>
<xml_diff>
--- a/ScribeFlow_REVISED.docx
+++ b/ScribeFlow_REVISED.docx
@@ -4532,6 +4532,26 @@
       </w:r>
     </w:p>
     <w:p>
+      <w:r>
+        <w:t>Production deployment (May 2026):</w:t>
+      </w:r>
+    </w:p>
+    <w:p>
+      <w:r>
+        <w:t>Live URL: https://scribeflow-two.vercel.app</w:t>
+      </w:r>
+    </w:p>
+    <w:p>
+      <w:r>
+        <w:t>Database: Supabase PostgreSQL (ap-south-1); serverless connections use aws-1-ap-south-1.pooler.supabase.com:6543.</w:t>
+      </w:r>
+    </w:p>
+    <w:p>
+      <w:r>
+        <w:t>Auth: NextAuth.js (Google OAuth + credentials), JWT sessions, edge-safe middleware (config/auth.config.ts).</w:t>
+      </w:r>
+    </w:p>
+    <w:p>
       <w:pPr>
         <w:spacing w:before="0" w:after="0" w:line="360"/>
         <w:ind w:right="0" w:left="0" w:firstLine="720"/>
@@ -4883,7 +4903,7 @@
           <w:u w:val="single"/>
           <w:shd w:fill="auto" w:val="clear"/>
         </w:rPr>
-        <w:t>Network: 100 Mbps symmetric fiber. RTT to Vercel edge (when deployed) and to Supabase eu-central-1 must be reported separately; India→Frankfurt database RTT is ~130 ms minimum one-way and must not be conflated with edge RTT.</w:t>
+        <w:t>Network: 100 Mbps symmetric fiber. RTT to Vercel edge and to Supabase ap-south-1 are reported separately; India→database RTT must not be conflated with edge RTT (~12 ms).</w:t>
       </w:r>
     </w:p>
     <w:p>
@@ -4909,7 +4929,7 @@
           <w:sz w:val="24"/>
           <w:shd w:fill="auto" w:val="clear"/>
         </w:rPr>
-        <w:t>Load tests used constant-arrival-rate scripts (benchmarks/k6/load.js and benchmarks/run-load-test.mjs) at 80–500 requests per second (RPS), reporting p50, p95, p99, mean, and standard deviation. Prior 10-user simulations are superseded by these results (Table IV). Baseline measurements were taken on the unoptimized initial implementation; optimized measurements were taken after applying React Server Components, connection pooling, and tree-shaken imports.</w:t>
+        <w:t>Load tests used constant-arrival-rate scripts (benchmarks/k6/load.js and benchmarks/run-load-test.mjs) at 80–500 requests per second (RPS), reporting p50, p95, p99, mean, and standard deviation (Tables IV and VI). Baseline measurements were taken on the unoptimized initial implementation; optimized measurements were taken after applying React Server Components, connection pooling, and tree-shaken imports.</w:t>
       </w:r>
     </w:p>
     <w:p>
@@ -6127,7 +6147,37 @@
     </w:p>
     <w:p>
       <w:r>
-        <w:t>Table IV — HTTP load test (production build, GET /, constant-arrival-rate, 45 s per run).</w:t>
+        <w:t>Table IV — HTTP load test (production build, GET /, localhost, constant-arrival-rate).</w:t>
+      </w:r>
+    </w:p>
+    <w:p>
+      <w:r>
+        <w:t>Table VI — Production WAN load test (GET /, deployed application).</w:t>
+      </w:r>
+    </w:p>
+    <w:p>
+      <w:r>
+        <w:t>Deployment URL: https://scribeflow-two.vercel.app</w:t>
+      </w:r>
+    </w:p>
+    <w:p>
+      <w:r>
+        <w:t>Region: Vercel serverless + Supabase ap-south-1 (Mumbai) via transaction pooler.</w:t>
+      </w:r>
+    </w:p>
+    <w:p>
+      <w:r>
+        <w:t>80 RPS, 30 s: p50=52 ms, p95=118 ms, p99=290 ms, mean=63 ms, σ=49 ms, errors=0%.</w:t>
+      </w:r>
+    </w:p>
+    <w:p>
+      <w:r>
+        <w:t>Evidence: benchmarks/results/load-rps80-1779211899204.json</w:t>
+      </w:r>
+    </w:p>
+    <w:p>
+      <w:r>
+        <w:t>Functional validation: OAuth signup/login, workspace ACL, autosave with OCC verified on production.</w:t>
       </w:r>
     </w:p>
     <w:p>
@@ -6147,17 +6197,12 @@
     </w:p>
     <w:p>
       <w:r>
-        <w:t>500 RPS: prior run showed dev-host saturation (24.4% errors at 500 RPS)—re-test on Vercel.</w:t>
-      </w:r>
-    </w:p>
-    <w:p>
-      <w:r>
-        <w:t>Reference Next.js @ 80 RPS: p50=2 ms, p95=3 ms, p99=4 ms (benchmarks/reference-stack/).</w:t>
-      </w:r>
-    </w:p>
-    <w:p>
-      <w:r>
-        <w:t>WAN: https://scribeflow.app did not resolve at test time; re-run: BASE_URL=&lt;Vercel URL&gt; node benchmarks/run-production-suite.mjs</w:t>
+        <w:t>500 RPS: dev host saturated (24.4% errors)—not a production capacity claim.</w:t>
+      </w:r>
+    </w:p>
+    <w:p>
+      <w:r>
+        <w:t>Reference Next.js @ 80 RPS (localhost): p50=2 ms, p95=3 ms, p99=4 ms.</w:t>
       </w:r>
     </w:p>
     <w:p>
@@ -7827,7 +7872,7 @@
           <w:sz w:val="24"/>
           <w:shd w:fill="auto" w:val="clear"/>
         </w:rPr>
-        <w:t>Several limitations constrain the generalizability of these results. First, production WAN tests require a live deployment URL; loopback results (Table IV) characterize the production build on standardized hardware. Second, there is no CRDT/OT real-time co-editing—only debounced autosave with version-based OCC. Third, ACL is not enterprise RBAC. Fourth, PostgreSQL RLS is not enabled. Fifth, JWT sessions lack server-side revocation. Sixth, Partial Prerendering, streaming SSR, and Edge runtime were not benchmarked. These limitations are acknowledged and motivate the future work described in Section VI.</w:t>
+        <w:t>Several limitations constrain the generalizability of these results. Limitations: (1) No CRDT/OT real-time co-editing—only debounced autosave with version-based OCC. (2) ACL is not enterprise RBAC. (3) PostgreSQL RLS is not enabled. (4) JWT sessions lack server-side revocation. (5) Partial Prerendering, streaming SSR, and Edge runtime were not benchmarked. These limitations are acknowledged and motivate the future work described in Section VI.</w:t>
       </w:r>
     </w:p>
     <w:p>
@@ -8120,12 +8165,12 @@
     </w:p>
     <w:p>
       <w:r>
-        <w:t>Appendix A — Implementation artifacts (repository paths).</w:t>
-      </w:r>
-    </w:p>
-    <w:p>
-      <w:r>
-        <w:t>Schema: lib/db/schema/app.ts · Auth: config/auth.ts, lib/auth.ts · ACL: lib/db/queries/workspace.ts, app/dashboard/(workspaces)/[workspaceId]/layout.tsx · Autosave/OCC: lib/db/queries/file.ts, app/dashboard/.../[fileId]/page.tsx · Middleware (auth only): middleware.ts</w:t>
+        <w:t>Appendix A — Implementation artifacts (repository: github.com/YaGYa07/Scribeflow).</w:t>
+      </w:r>
+    </w:p>
+    <w:p>
+      <w:r>
+        <w:t>Schema: lib/db/schema/app.ts · Auth: config/auth-providers.ts, lib/auth.ts · ACL: lib/db/queries/workspace.ts · DB pooler (Vercel): lib/db/database-url.ts · Autosave/OCC: lib/db/queries/file.ts</w:t>
       </w:r>
     </w:p>
     <w:p>

</xml_diff>